<commit_message>
Updated task 1 draft
</commit_message>
<xml_diff>
--- a/Task 1.docx
+++ b/Task 1.docx
@@ -39,7 +39,7 @@
         <w:t>shipment lifecycle and hierarchy</w:t>
       </w:r>
       <w:r>
-        <w:t xml:space="preserve"> for a logistics operator. Shipments are organised into a recursive hierarchy — a national </w:t>
+        <w:t xml:space="preserve"> for a logistics operator. Shipments are organised into a recursive hierarchy a national </w:t>
       </w:r>
       <w:proofErr w:type="spellStart"/>
       <w:r>
@@ -63,7 +63,7 @@
       </w:r>
       <w:proofErr w:type="spellEnd"/>
       <w:r>
-        <w:t>. Each ShipmentItem is delivered exactly once, and that delivery has a real lifecycle (created → picked up → in transit → delivered) with actions that only make sense in certain states. Operators can attach optional handling requirements (insurance, priority handling) to any shipment at runtime, stacked in any combination. Staff need to view the hierarchy in different ways — a full manifest of everything, or just what's urgent.</w:t>
+        <w:t>. Each ShipmentItem is delivered exactly once, and that delivery has a real lifecycle  with actions that only make sense in certain states. Operators can attach optional handling requirements (insurance, priority handling) to any shipment at runtime, stacked in any combination. Staff need to view the hierarchy in different ways a full manifest of everything, or just what's urgent.</w:t>
       </w:r>
     </w:p>
     <w:p>
@@ -395,7 +395,7 @@
     </w:p>
     <w:p>
       <w:r>
-        <w:t>We separated Delivery from ShipmentItem rather than making the item itself carry state, so that hierarchy concerns (Composite) and lifecycle concerns (State) stay decoupled — a ShipmentItem owns exactly one Delivery via composition, and the item's destructor is responsible for deleting it, giving us clean polymorphic destruction without shared ownership ambiguity.</w:t>
+        <w:t>We separated Delivery from ShipmentItem rather than making the item itself carry state, so that hierarchy concerns (Composite) and lifecycle concerns (State) stay decoupled  a ShipmentItem owns exactly one Delivery via composition, and the item's destructor is responsible for deleting it, giving us clean polymorphic destruction without shared ownership ambiguity.</w:t>
       </w:r>
     </w:p>
     <w:p>
@@ -413,7 +413,7 @@
       </w:r>
       <w:proofErr w:type="spellEnd"/>
       <w:r>
-        <w:t>*&gt;) and deletes them in its own destructor, so destroying any subtree — regardless of depth or mix of leaves/groups — is a single recursive call with no dangling pointers or leaks.</w:t>
+        <w:t>*&gt;) and deletes them in its own destructor, so destroying any subtree regardless of depth or mix of leaves/groups is a single recursive call with no dangling pointers or leaks.</w:t>
       </w:r>
     </w:p>
     <w:p>
@@ -455,7 +455,7 @@
       </w:r>
       <w:proofErr w:type="spellEnd"/>
       <w:r>
-        <w:t xml:space="preserve"> copy pointers into an internal vector at construction time rather than reading live from the tree. This means an in-progress traversal is unaffected — and safe — if a shipment is relocated or removed mid-iteration; it simply won't reflect the change until a new iterator is created. We chose snapshot over live traversal because live traversal over a vector being mutated elsewhere risks iterator invalidation, and a logistics dispatcher printing a manifest shouldn't have that list shift under them mid-print.</w:t>
+        <w:t xml:space="preserve"> copy pointers into an internal vector at construction time rather than reading live from the tree. This means an in-progress traversal is unaffected and safe if a shipment is relocated or removed mid-iteration; it simply won't reflect the change until a new iterator is created. We chose snapshot over live traversal because live traversal over a vector being mutated elsewhere risks iterator invalidation, and a logistics dispatcher printing a manifest shouldn't have that list shift under them mid-print.</w:t>
       </w:r>
     </w:p>
     <w:p>
@@ -508,7 +508,7 @@
       </w:r>
       <w:proofErr w:type="spellEnd"/>
       <w:r>
-        <w:t xml:space="preserve">* is expected — including being placed inside a </w:t>
+        <w:t xml:space="preserve">* is expected including being placed inside a </w:t>
       </w:r>
       <w:proofErr w:type="spellStart"/>
       <w:r>
@@ -1134,6 +1134,7 @@
   <w:style w:type="character" w:default="1" w:styleId="DefaultParagraphFont">
     <w:name w:val="Default Paragraph Font"/>
     <w:uiPriority w:val="1"/>
+    <w:semiHidden/>
     <w:unhideWhenUsed/>
   </w:style>
   <w:style w:type="table" w:default="1" w:styleId="TableNormal">

</xml_diff>